<commit_message>
docs: streamline lab report to 4 core modules + auth modal
</commit_message>
<xml_diff>
--- a/docs/Laboratorna_Robota_2_Bahyn_MkV_Sales_Manager.docx
+++ b/docs/Laboratorna_Robota_2_Bahyn_MkV_Sales_Manager.docx
@@ -158,7 +158,7 @@
           <w:i w:val="0"/>
           <w:sz w:val="28"/>
         </w:rPr>
-        <w:t>Мета роботи: Спроєктувати та представити фінальний UI/UX дизайн веб-застосунку CRM-платформи «MkV Sales Manager» для таргетологів і SMM-спеціалістів на основі напрацювань першої лабораторної роботи. Створити макети ключових сторінок платформи, розробити окремий модуль авторизації користувача, підготувати компоненти для подальшої розробки на React та налаштувати роботу з репозиторієм у Git і GitHub (публікація проєкту, запрошення рецензентів, відкриття Pull Request).</w:t>
+        <w:t>Мета роботи: Спроєктувати та представити фінальний UI/UX дизайн веб-застосунку CRM-платформи «MkV Sales Manager» для таргетологів і SMM-спеціалістів на основі напрацювань першої лабораторної роботи. Створити макети ключових сторінок платформи (аналітика, ШІ-студія, управління кампаніями та контроль вигорання), розробити окремий модуль авторизації користувача, підготувати компоненти для подальшої розробки на React та налаштувати роботу з репозиторієм у Git і GitHub (публікація проєкту, запрошення рецензентів, відкриття Pull Request).</w:t>
       </w:r>
     </w:p>
     <w:p>
@@ -202,7 +202,7 @@
           <w:i w:val="0"/>
           <w:sz w:val="28"/>
         </w:rPr>
-        <w:t>Проєкт «MkV Sales Manager CRM» — це веб-платформа для таргетологів, SMM-фахівців та медіабаєрів. Звичайні CRM-системи (наприклад HubSpot чи Bitrix24) створені лише для ведення бази клієнтів і фіксації дзвінків, але в них незручно працювати з рекламними кабінетами: тестувати креативи, слідкувати за ставками та вчасно зупиняти збиткові оголошення.</w:t>
+        <w:t>Проєкт «MkV Sales Manager CRM» — це веб-платформа для таргетологів, SMM-фахівців та медіабаєрів. Звичайні CRM-системи (наприклад HubSpot чи Bitrix24) створені лише для ведення бази клієнтів і фіксації дзвінків, але в них незручно працювати з рекламою: тестувати креативи, слідкувати за ставками та вчасно зупиняти збиткові оголошення.</w:t>
       </w:r>
     </w:p>
     <w:p>
@@ -1624,7 +1624,7 @@
           <w:i w:val="0"/>
           <w:sz w:val="28"/>
         </w:rPr>
-        <w:t>На рисунку 1.1 показано загальний вигляд робочого простору MkV Sales Manager CRM, де зібрані ключові показники та меню переходу між модулями.</w:t>
+        <w:t>На рисунку 1.1 показано загальний вигляд робочого простору MkV Sales Manager CRM, де зібрані ключові показники та навігація між основними модулями платформи.</w:t>
       </w:r>
     </w:p>
     <w:p>
@@ -3054,7 +3054,7 @@
           <w:b/>
           <w:sz w:val="28"/>
         </w:rPr>
-        <w:t>2.2. Сторінка 1: Головний навігаційний портал (Master Hub Overview)</w:t>
+        <w:t>2.2. Сторінка 1: Головна панель крос-платформної аналітики (Analytics Dashboard)</w:t>
       </w:r>
     </w:p>
     <w:p>
@@ -3070,7 +3070,7 @@
           <w:i w:val="0"/>
           <w:sz w:val="28"/>
         </w:rPr>
-        <w:t>Головна сторінка (рис. 2.1) — це точка входу в CRM. Зверху розміщено перемикач клієнтських проєктів (наприклад EcoCosmetics EU), рядок пошуку та вибір періоду дат. Нижче розташовані картки швидкого переходу до всіх 7 основних розділів платформи зі статусами їхньої роботи.</w:t>
+        <w:t>Дашборд аналітики (рис. 2.1) показує зведені результати реклами по всіх каналах. Верхні картки виводять ключові показники: суму витрат ($18,420), окупність (3.84x ROAS), ціну за результат ($14.20) та кількість покупок. Нижче розміщено графік динаміки по мережах і таблицю кампаній, де рекламу можна зупиняти або запускати перемикачами прямо на місці.</w:t>
       </w:r>
     </w:p>
     <w:p>
@@ -3084,91 +3084,6 @@
           <wp:inline xmlns:a="http://schemas.openxmlformats.org/drawingml/2006/main" xmlns:pic="http://schemas.openxmlformats.org/drawingml/2006/picture">
             <wp:extent cx="5669280" cy="3779520"/>
             <wp:docPr id="2" name="Picture 2"/>
-            <wp:cNvGraphicFramePr>
-              <a:graphicFrameLocks noChangeAspect="1"/>
-            </wp:cNvGraphicFramePr>
-            <a:graphic>
-              <a:graphicData uri="http://schemas.openxmlformats.org/drawingml/2006/picture">
-                <pic:pic>
-                  <pic:nvPicPr>
-                    <pic:cNvPr id="0" name="img_10_image1.png"/>
-                    <pic:cNvPicPr/>
-                  </pic:nvPicPr>
-                  <pic:blipFill>
-                    <a:blip r:embed="rId9"/>
-                    <a:stretch>
-                      <a:fillRect/>
-                    </a:stretch>
-                  </pic:blipFill>
-                  <pic:spPr>
-                    <a:xfrm>
-                      <a:off x="0" y="0"/>
-                      <a:ext cx="5669280" cy="3779520"/>
-                    </a:xfrm>
-                    <a:prstGeom prst="rect"/>
-                  </pic:spPr>
-                </pic:pic>
-              </a:graphicData>
-            </a:graphic>
-          </wp:inline>
-        </w:drawing>
-      </w:r>
-    </w:p>
-    <w:p>
-      <w:pPr>
-        <w:spacing w:before="0" w:after="240"/>
-        <w:ind w:firstLine="0"/>
-        <w:jc w:val="center"/>
-      </w:pPr>
-      <w:r>
-        <w:rPr>
-          <w:rFonts w:ascii="Times New Roman" w:hAnsi="Times New Roman"/>
-          <w:sz w:val="24"/>
-        </w:rPr>
-        <w:t>Рис. 2.1. Фінальний дизайн Головного навігаційного хабу (Master Hub Overview)</w:t>
-      </w:r>
-    </w:p>
-    <w:p>
-      <w:pPr>
-        <w:spacing w:before="280" w:after="120" w:line="276" w:lineRule="auto"/>
-        <w:jc w:val="left"/>
-      </w:pPr>
-      <w:r>
-        <w:rPr>
-          <w:rFonts w:ascii="Times New Roman" w:hAnsi="Times New Roman"/>
-          <w:b/>
-          <w:sz w:val="28"/>
-        </w:rPr>
-        <w:t>2.2. Сторінка 2: Панель крос-платформної аналітики (Analytics Dashboard)</w:t>
-      </w:r>
-    </w:p>
-    <w:p>
-      <w:pPr>
-        <w:spacing w:before="0" w:after="120" w:line="276" w:lineRule="auto"/>
-        <w:ind w:firstLine="706"/>
-        <w:jc w:val="both"/>
-      </w:pPr>
-      <w:r>
-        <w:rPr>
-          <w:rFonts w:ascii="Times New Roman" w:hAnsi="Times New Roman"/>
-          <w:b w:val="0"/>
-          <w:i w:val="0"/>
-          <w:sz w:val="28"/>
-        </w:rPr>
-        <w:t>Дашборд аналітики (рис. 2.2) показує зведені результати реклами. Верхні картки виводять ключові показники: суму витрат ($18,420), окупність (3.84x ROAS), ціну за результат ($14.20) та кількість покупок. Нижче розміщено графік динаміки по мережах і таблицю кампаній, де рекламу можна зупиняти або запускати перемикачами прямо на місці.</w:t>
-      </w:r>
-    </w:p>
-    <w:p>
-      <w:pPr>
-        <w:spacing w:before="200" w:after="80"/>
-        <w:ind w:firstLine="0"/>
-        <w:jc w:val="center"/>
-      </w:pPr>
-      <w:r>
-        <w:drawing>
-          <wp:inline xmlns:a="http://schemas.openxmlformats.org/drawingml/2006/main" xmlns:pic="http://schemas.openxmlformats.org/drawingml/2006/picture">
-            <wp:extent cx="5669280" cy="3779520"/>
-            <wp:docPr id="3" name="Picture 3"/>
             <wp:cNvGraphicFramePr>
               <a:graphicFrameLocks noChangeAspect="1"/>
             </wp:cNvGraphicFramePr>
@@ -3210,7 +3125,7 @@
           <w:rFonts w:ascii="Times New Roman" w:hAnsi="Times New Roman"/>
           <w:sz w:val="24"/>
         </w:rPr>
-        <w:t>Рис. 2.2. Фінальний дизайн панелі крос-платформної аналітики (Analytics Dashboard)</w:t>
+        <w:t>Рис. 2.1. Фінальний дизайн панелі крос-платформної аналітики (Analytics Dashboard)</w:t>
       </w:r>
     </w:p>
     <w:p>
@@ -3224,7 +3139,7 @@
           <w:b/>
           <w:sz w:val="28"/>
         </w:rPr>
-        <w:t>2.4. Сторінка 3: Креативна ШІ-студія та відео-розкадрування (AI Creative Studio)</w:t>
+        <w:t>2.3. Сторінка 2: Креативна ШІ-студія та відео-розкадрування (AI Creative Studio)</w:t>
       </w:r>
     </w:p>
     <w:p>
@@ -3240,7 +3155,7 @@
           <w:i w:val="0"/>
           <w:sz w:val="28"/>
         </w:rPr>
-        <w:t>Розділ створення креативів (рис. 2.3) допомагає писати сценарії для Reels та TikTok. Користувач обирає аудиторію та тип маркетингового гачка (Problem/Solution, Curiosity Gap тощо), після чого ШІ розбиває відео на 3 сцени: перші 3 секунди для залучення уваги (Hook), демонстрація проблеми та заклик до дії (CTA), додаючи титри та голосову озвучку.</w:t>
+        <w:t>Розділ створення креативів (рис. 2.2) допомагає писати сценарії для Reels та TikTok. Користувач обирає аудиторію та тип маркетингового гачка (Problem/Solution, Curiosity Gap тощо), після чого ШІ розбиває відео на 3 сцени: перші 3 секунди для залучення уваги (Hook), демонстрація проблеми та заклик до дії (CTA), додаючи титри та голосову озвучку.</w:t>
       </w:r>
     </w:p>
     <w:p>
@@ -3253,7 +3168,7 @@
         <w:drawing>
           <wp:inline xmlns:a="http://schemas.openxmlformats.org/drawingml/2006/main" xmlns:pic="http://schemas.openxmlformats.org/drawingml/2006/picture">
             <wp:extent cx="5669280" cy="3779520"/>
-            <wp:docPr id="4" name="Picture 4"/>
+            <wp:docPr id="3" name="Picture 3"/>
             <wp:cNvGraphicFramePr>
               <a:graphicFrameLocks noChangeAspect="1"/>
             </wp:cNvGraphicFramePr>
@@ -3295,7 +3210,7 @@
           <w:rFonts w:ascii="Times New Roman" w:hAnsi="Times New Roman"/>
           <w:sz w:val="24"/>
         </w:rPr>
-        <w:t>Рис. 2.3. Фінальний дизайн креативної ШІ-студії та відео-розкадрування (AI Creative Studio)</w:t>
+        <w:t>Рис. 2.2. Фінальний дизайн креативної ШІ-студії та відео-розкадрування (AI Creative Studio)</w:t>
       </w:r>
     </w:p>
     <w:p>
@@ -3309,7 +3224,7 @@
           <w:b/>
           <w:sz w:val="28"/>
         </w:rPr>
-        <w:t>2.5. Сторінка 4: Центр управління кампаніями та авто-правилами (Campaigns &amp; Traffic Rules)</w:t>
+        <w:t>2.4. Сторінка 3: Центр управління кампаніями та медіабаїнгом (Campaigns &amp; Media Buying)</w:t>
       </w:r>
     </w:p>
     <w:p>
@@ -3325,7 +3240,7 @@
           <w:i w:val="0"/>
           <w:sz w:val="28"/>
         </w:rPr>
-        <w:t>Модуль управління кампаніями (рис. 2.4) відповідає за бюджети та автоматичні правила. Тут можна вмикати авто-паузу, якщо CPA перевищує $22, або додавати +20% до бюджету зв'язок з окупністю вище 4.0x. Також у таблиці можна швидко змінювати денні ліміти для кількох кабінетів одночасно.</w:t>
+        <w:t>Модуль управління кампаніями (рис. 2.3) відповідає за бюджети та автоматичні правила. Тут можна вмикати авто-паузу, якщо CPA перевищує $22, або додавати +20% до бюджету зв'язок з окупністю вище 4.0x. Також у таблиці можна швидко змінювати денні ліміти для кількох кабінетів одночасно.</w:t>
       </w:r>
     </w:p>
     <w:p>
@@ -3338,7 +3253,7 @@
         <w:drawing>
           <wp:inline xmlns:a="http://schemas.openxmlformats.org/drawingml/2006/main" xmlns:pic="http://schemas.openxmlformats.org/drawingml/2006/picture">
             <wp:extent cx="5669280" cy="3779520"/>
-            <wp:docPr id="5" name="Picture 5"/>
+            <wp:docPr id="4" name="Picture 4"/>
             <wp:cNvGraphicFramePr>
               <a:graphicFrameLocks noChangeAspect="1"/>
             </wp:cNvGraphicFramePr>
@@ -3380,7 +3295,7 @@
           <w:rFonts w:ascii="Times New Roman" w:hAnsi="Times New Roman"/>
           <w:sz w:val="24"/>
         </w:rPr>
-        <w:t>Рис. 2.4. Фінальний дизайн центру управління кампаніями та авто-правилами (Campaigns &amp; Traffic Rules)</w:t>
+        <w:t>Рис. 2.3. Фінальний дизайн центру управління кампаніями та медіабаїнгом (Campaigns &amp; Media Buying)</w:t>
       </w:r>
     </w:p>
     <w:p>
@@ -3394,7 +3309,7 @@
           <w:b/>
           <w:sz w:val="28"/>
         </w:rPr>
-        <w:t>2.6. Сторінка 5: Детектор вигорання аудиторії та здоров'я креативів (Ad Fatigue Detector)</w:t>
+        <w:t>2.5. Сторінка 4: Детектор вигорання аудиторії та ротація хуків (Ad Fatigue Detector &amp; Hooks)</w:t>
       </w:r>
     </w:p>
     <w:p>
@@ -3410,7 +3325,7 @@
           <w:i w:val="0"/>
           <w:sz w:val="28"/>
         </w:rPr>
-        <w:t>Детектор вигорання (рис. 2.5) відстежує, коли реклама набридає людям через часті покази (Frequency &gt; 2.8). На графіку видно, як при цьому падає клікабельність (CTR). Система позначає проблемні оголошення та дає можливість в один клік замінити перші 3 секунди хука без перезапуску всієї кампанії.</w:t>
+        <w:t>Детектор вигорання (рис. 2.4) відстежує, коли реклама набридає людям через часті покази (Frequency &gt; 2.8). На графіку видно, як при цьому падає клікабельність (CTR). Система позначає проблемні оголошення та дає можливість в один клік замінити перші 3 секунди хука без перезапуску всієї кампанії.</w:t>
       </w:r>
     </w:p>
     <w:p>
@@ -3423,7 +3338,7 @@
         <w:drawing>
           <wp:inline xmlns:a="http://schemas.openxmlformats.org/drawingml/2006/main" xmlns:pic="http://schemas.openxmlformats.org/drawingml/2006/picture">
             <wp:extent cx="5669280" cy="3779520"/>
-            <wp:docPr id="6" name="Picture 6"/>
+            <wp:docPr id="5" name="Picture 5"/>
             <wp:cNvGraphicFramePr>
               <a:graphicFrameLocks noChangeAspect="1"/>
             </wp:cNvGraphicFramePr>
@@ -3465,7 +3380,7 @@
           <w:rFonts w:ascii="Times New Roman" w:hAnsi="Times New Roman"/>
           <w:sz w:val="24"/>
         </w:rPr>
-        <w:t>Рис. 2.5. Фінальний дизайн детектора вигорання аудиторії та здоров'я креативів (Ad Fatigue Detector)</w:t>
+        <w:t>Рис. 2.4. Фінальний дизайн детектора вигорання аудиторії та ротації хуків (Ad Fatigue Detector &amp; Hooks)</w:t>
       </w:r>
     </w:p>
     <w:p>
@@ -3479,7 +3394,7 @@
           <w:b/>
           <w:sz w:val="28"/>
         </w:rPr>
-        <w:t>2.7. Сторінка 6: Інтерактивна база знань та чеклисти CAPI (Knowledge Base &amp; CAPI)</w:t>
+        <w:t>2.6. Модуль авторизації користувача (MkV Sales Manager Auth Modal)</w:t>
       </w:r>
     </w:p>
     <w:p>
@@ -3495,7 +3410,7 @@
           <w:i w:val="0"/>
           <w:sz w:val="28"/>
         </w:rPr>
-        <w:t>База знань (рис. 2.6) зібрана у вигляді практичних чеклистів: як налаштувати серверний Meta CAPI, як підключити TikTok Spark Ads та Google Performance Max, а також модуль перевірки трасту рекламного акаунта для захисту від блокувань.</w:t>
+        <w:t>Згідно з обов'язковою вимогою навчального завдання щодо окремого модуля авторизації, спроєктовано модальне вікно входу (рис. 2.5). Воно дозволяє швидко увійти через корпоративний Google чи Meta акаунт (OAuth 2.0), або ввести робочу пошту та персональний API-токен з перевіркою прав доступу.</w:t>
       </w:r>
     </w:p>
     <w:p>
@@ -3508,7 +3423,7 @@
         <w:drawing>
           <wp:inline xmlns:a="http://schemas.openxmlformats.org/drawingml/2006/main" xmlns:pic="http://schemas.openxmlformats.org/drawingml/2006/picture">
             <wp:extent cx="5669280" cy="3779520"/>
-            <wp:docPr id="7" name="Picture 7"/>
+            <wp:docPr id="6" name="Picture 6"/>
             <wp:cNvGraphicFramePr>
               <a:graphicFrameLocks noChangeAspect="1"/>
             </wp:cNvGraphicFramePr>
@@ -3516,7 +3431,7 @@
               <a:graphicData uri="http://schemas.openxmlformats.org/drawingml/2006/picture">
                 <pic:pic>
                   <pic:nvPicPr>
-                    <pic:cNvPr id="0" name="img_11_image6.png"/>
+                    <pic:cNvPr id="0" name="img_17_image9.png"/>
                     <pic:cNvPicPr/>
                   </pic:nvPicPr>
                   <pic:blipFill>
@@ -3550,7 +3465,7 @@
           <w:rFonts w:ascii="Times New Roman" w:hAnsi="Times New Roman"/>
           <w:sz w:val="24"/>
         </w:rPr>
-        <w:t>Рис. 2.6. Фінальний дизайн інтерактивної бази знань та чеклистів CAPI (Knowledge Base &amp; CAPI)</w:t>
+        <w:t>Рис. 2.5. Фінальний дизайн модального вікна авторизації таргетолога (OAuth 2.0 SSO та корпоративний токен)</w:t>
       </w:r>
     </w:p>
     <w:p>
@@ -3564,232 +3479,7 @@
           <w:b/>
           <w:sz w:val="28"/>
         </w:rPr>
-        <w:t>2.8. Сторінки 7 та 8: Мультиплатформна атрибуція та офіційні API-інтеграції</w:t>
-      </w:r>
-    </w:p>
-    <w:p>
-      <w:pPr>
-        <w:spacing w:before="0" w:after="120" w:line="276" w:lineRule="auto"/>
-        <w:ind w:firstLine="706"/>
-        <w:jc w:val="both"/>
-      </w:pPr>
-      <w:r>
-        <w:rPr>
-          <w:rFonts w:ascii="Times New Roman" w:hAnsi="Times New Roman"/>
-          <w:b w:val="0"/>
-          <w:i w:val="0"/>
-          <w:sz w:val="28"/>
-        </w:rPr>
-        <w:t>На сторінці атрибуції (рис. 2.7) візуалізовано шлях покупця через різні платформи (наприклад: побачив у TikTok -&gt; знайшов у Google -&gt; купив через ретаргетинг в Instagram) та роботу з Lookalike списками. Сторінка інтеграцій (рис. 2.8) показує стан підключення офіційних API рекламних мереж та дозволяє роздати права доступу членам команди.</w:t>
-      </w:r>
-    </w:p>
-    <w:p>
-      <w:pPr>
-        <w:spacing w:before="200" w:after="80"/>
-        <w:ind w:firstLine="0"/>
-        <w:jc w:val="center"/>
-      </w:pPr>
-      <w:r>
-        <w:drawing>
-          <wp:inline xmlns:a="http://schemas.openxmlformats.org/drawingml/2006/main" xmlns:pic="http://schemas.openxmlformats.org/drawingml/2006/picture">
-            <wp:extent cx="5669280" cy="3779520"/>
-            <wp:docPr id="8" name="Picture 8"/>
-            <wp:cNvGraphicFramePr>
-              <a:graphicFrameLocks noChangeAspect="1"/>
-            </wp:cNvGraphicFramePr>
-            <a:graphic>
-              <a:graphicData uri="http://schemas.openxmlformats.org/drawingml/2006/picture">
-                <pic:pic>
-                  <pic:nvPicPr>
-                    <pic:cNvPr id="0" name="img_5_image7.png"/>
-                    <pic:cNvPicPr/>
-                  </pic:nvPicPr>
-                  <pic:blipFill>
-                    <a:blip r:embed="rId15"/>
-                    <a:stretch>
-                      <a:fillRect/>
-                    </a:stretch>
-                  </pic:blipFill>
-                  <pic:spPr>
-                    <a:xfrm>
-                      <a:off x="0" y="0"/>
-                      <a:ext cx="5669280" cy="3779520"/>
-                    </a:xfrm>
-                    <a:prstGeom prst="rect"/>
-                  </pic:spPr>
-                </pic:pic>
-              </a:graphicData>
-            </a:graphic>
-          </wp:inline>
-        </w:drawing>
-      </w:r>
-    </w:p>
-    <w:p>
-      <w:pPr>
-        <w:spacing w:before="0" w:after="240"/>
-        <w:ind w:firstLine="0"/>
-        <w:jc w:val="center"/>
-      </w:pPr>
-      <w:r>
-        <w:rPr>
-          <w:rFonts w:ascii="Times New Roman" w:hAnsi="Times New Roman"/>
-          <w:sz w:val="24"/>
-        </w:rPr>
-        <w:t>Рис. 2.7. Фінальний дизайн панелі мультиплатформної атрибуції та аудиторій (Audiences &amp; Attribution)</w:t>
-      </w:r>
-    </w:p>
-    <w:p>
-      <w:pPr>
-        <w:spacing w:before="200" w:after="80"/>
-        <w:ind w:firstLine="0"/>
-        <w:jc w:val="center"/>
-      </w:pPr>
-      <w:r>
-        <w:drawing>
-          <wp:inline xmlns:a="http://schemas.openxmlformats.org/drawingml/2006/main" xmlns:pic="http://schemas.openxmlformats.org/drawingml/2006/picture">
-            <wp:extent cx="5669280" cy="3779520"/>
-            <wp:docPr id="9" name="Picture 9"/>
-            <wp:cNvGraphicFramePr>
-              <a:graphicFrameLocks noChangeAspect="1"/>
-            </wp:cNvGraphicFramePr>
-            <a:graphic>
-              <a:graphicData uri="http://schemas.openxmlformats.org/drawingml/2006/picture">
-                <pic:pic>
-                  <pic:nvPicPr>
-                    <pic:cNvPr id="0" name="img_1_image8.png"/>
-                    <pic:cNvPicPr/>
-                  </pic:nvPicPr>
-                  <pic:blipFill>
-                    <a:blip r:embed="rId16"/>
-                    <a:stretch>
-                      <a:fillRect/>
-                    </a:stretch>
-                  </pic:blipFill>
-                  <pic:spPr>
-                    <a:xfrm>
-                      <a:off x="0" y="0"/>
-                      <a:ext cx="5669280" cy="3779520"/>
-                    </a:xfrm>
-                    <a:prstGeom prst="rect"/>
-                  </pic:spPr>
-                </pic:pic>
-              </a:graphicData>
-            </a:graphic>
-          </wp:inline>
-        </w:drawing>
-      </w:r>
-    </w:p>
-    <w:p>
-      <w:pPr>
-        <w:spacing w:before="0" w:after="240"/>
-        <w:ind w:firstLine="0"/>
-        <w:jc w:val="center"/>
-      </w:pPr>
-      <w:r>
-        <w:rPr>
-          <w:rFonts w:ascii="Times New Roman" w:hAnsi="Times New Roman"/>
-          <w:sz w:val="24"/>
-        </w:rPr>
-        <w:t>Рис. 2.8. Фінальний дизайн центру офіційних API-інтеграцій та прав доступу (Official API Integrations)</w:t>
-      </w:r>
-    </w:p>
-    <w:p>
-      <w:pPr>
-        <w:spacing w:before="280" w:after="120" w:line="276" w:lineRule="auto"/>
-        <w:jc w:val="left"/>
-      </w:pPr>
-      <w:r>
-        <w:rPr>
-          <w:rFonts w:ascii="Times New Roman" w:hAnsi="Times New Roman"/>
-          <w:b/>
-          <w:sz w:val="28"/>
-        </w:rPr>
-        <w:t>2.9. Модуль авторизації таргетолога та SSO-підключення (MkV Sales Manager Auth Modal)</w:t>
-      </w:r>
-    </w:p>
-    <w:p>
-      <w:pPr>
-        <w:spacing w:before="0" w:after="120" w:line="276" w:lineRule="auto"/>
-        <w:ind w:firstLine="706"/>
-        <w:jc w:val="both"/>
-      </w:pPr>
-      <w:r>
-        <w:rPr>
-          <w:rFonts w:ascii="Times New Roman" w:hAnsi="Times New Roman"/>
-          <w:b w:val="0"/>
-          <w:i w:val="0"/>
-          <w:sz w:val="28"/>
-        </w:rPr>
-        <w:t>Згідно з обов'язковою вимогою завдання щодо окремого модуля авторизації, спроєктовано модальне вікно входу (рис. 2.9). Воно дозволяє швидко увійти через корпоративний Google чи Meta акаунт (OAuth 2.0), або ввести робочу пошту та персональний API-токен з перевіркою прав доступу.</w:t>
-      </w:r>
-    </w:p>
-    <w:p>
-      <w:pPr>
-        <w:spacing w:before="200" w:after="80"/>
-        <w:ind w:firstLine="0"/>
-        <w:jc w:val="center"/>
-      </w:pPr>
-      <w:r>
-        <w:drawing>
-          <wp:inline xmlns:a="http://schemas.openxmlformats.org/drawingml/2006/main" xmlns:pic="http://schemas.openxmlformats.org/drawingml/2006/picture">
-            <wp:extent cx="5669280" cy="3779520"/>
-            <wp:docPr id="10" name="Picture 10"/>
-            <wp:cNvGraphicFramePr>
-              <a:graphicFrameLocks noChangeAspect="1"/>
-            </wp:cNvGraphicFramePr>
-            <a:graphic>
-              <a:graphicData uri="http://schemas.openxmlformats.org/drawingml/2006/picture">
-                <pic:pic>
-                  <pic:nvPicPr>
-                    <pic:cNvPr id="0" name="img_17_image9.png"/>
-                    <pic:cNvPicPr/>
-                  </pic:nvPicPr>
-                  <pic:blipFill>
-                    <a:blip r:embed="rId17"/>
-                    <a:stretch>
-                      <a:fillRect/>
-                    </a:stretch>
-                  </pic:blipFill>
-                  <pic:spPr>
-                    <a:xfrm>
-                      <a:off x="0" y="0"/>
-                      <a:ext cx="5669280" cy="3779520"/>
-                    </a:xfrm>
-                    <a:prstGeom prst="rect"/>
-                  </pic:spPr>
-                </pic:pic>
-              </a:graphicData>
-            </a:graphic>
-          </wp:inline>
-        </w:drawing>
-      </w:r>
-    </w:p>
-    <w:p>
-      <w:pPr>
-        <w:spacing w:before="0" w:after="240"/>
-        <w:ind w:firstLine="0"/>
-        <w:jc w:val="center"/>
-      </w:pPr>
-      <w:r>
-        <w:rPr>
-          <w:rFonts w:ascii="Times New Roman" w:hAnsi="Times New Roman"/>
-          <w:sz w:val="24"/>
-        </w:rPr>
-        <w:t>Рис. 2.9. Фінальний дизайн модального вікна авторизації таргетолога (OAuth 2.0 SSO та корпоративний токен)</w:t>
-      </w:r>
-    </w:p>
-    <w:p>
-      <w:pPr>
-        <w:spacing w:before="280" w:after="120" w:line="276" w:lineRule="auto"/>
-        <w:jc w:val="left"/>
-      </w:pPr>
-      <w:r>
-        <w:rPr>
-          <w:rFonts w:ascii="Times New Roman" w:hAnsi="Times New Roman"/>
-          <w:b/>
-          <w:sz w:val="28"/>
-        </w:rPr>
-        <w:t>2.10. Архітектурна підготовка до семестрової реалізації проєкту на базі React</w:t>
+        <w:t>2.7. Архітектурна підготовка до семестрової реалізації проєкту на базі React</w:t>
       </w:r>
     </w:p>
     <w:p>
@@ -4092,7 +3782,7 @@
         <w:drawing>
           <wp:inline xmlns:a="http://schemas.openxmlformats.org/drawingml/2006/main" xmlns:pic="http://schemas.openxmlformats.org/drawingml/2006/picture">
             <wp:extent cx="5669280" cy="2731743"/>
-            <wp:docPr id="11" name="Picture 11"/>
+            <wp:docPr id="7" name="Picture 7"/>
             <wp:cNvGraphicFramePr>
               <a:graphicFrameLocks noChangeAspect="1"/>
             </wp:cNvGraphicFramePr>
@@ -4104,7 +3794,7 @@
                     <pic:cNvPicPr/>
                   </pic:nvPicPr>
                   <pic:blipFill>
-                    <a:blip r:embed="rId18"/>
+                    <a:blip r:embed="rId15"/>
                     <a:stretch>
                       <a:fillRect/>
                     </a:stretch>
@@ -4177,7 +3867,7 @@
         <w:drawing>
           <wp:inline xmlns:a="http://schemas.openxmlformats.org/drawingml/2006/main" xmlns:pic="http://schemas.openxmlformats.org/drawingml/2006/picture">
             <wp:extent cx="5669280" cy="1178838"/>
-            <wp:docPr id="12" name="Picture 12"/>
+            <wp:docPr id="8" name="Picture 8"/>
             <wp:cNvGraphicFramePr>
               <a:graphicFrameLocks noChangeAspect="1"/>
             </wp:cNvGraphicFramePr>
@@ -4189,7 +3879,7 @@
                     <pic:cNvPicPr/>
                   </pic:nvPicPr>
                   <pic:blipFill>
-                    <a:blip r:embed="rId19"/>
+                    <a:blip r:embed="rId16"/>
                     <a:stretch>
                       <a:fillRect/>
                     </a:stretch>
@@ -4265,7 +3955,7 @@
           <w:i w:val="0"/>
           <w:sz w:val="28"/>
         </w:rPr>
-        <w:t>1. Замість обов'язкових трьох сторінок я спроєктував 8 повноцінних екранів платформи: головний навігаційний портал, дашборд крос-платформної аналітики, ШІ-студію створення сценаріїв для відео, центр керування бюджетами та правилами, детектор вигорання аудиторії, базу технічних знань з чеклистами, екран атрибуції шляху клієнта та розділ підключення API.</w:t>
+        <w:t>1. Спроєктував дизайн 4 ключових функціональних екранів платформи: дашборд крос-платформної аналітики для контролю витрат, ШІ-студію створення сценаріїв для коротких відео, центр управління кампаніями та бюджетами, а також модуль виявлення вигорання аудиторії зі швидкою ротацією хуків.</w:t>
       </w:r>
     </w:p>
     <w:p>
@@ -4281,7 +3971,7 @@
           <w:i w:val="0"/>
           <w:sz w:val="28"/>
         </w:rPr>
-        <w:t>2. Окремо розробив модальне вікно авторизації таргетолога з можливістю швидкого входу через корпоративний Google / Meta акаунт (OAuth 2.0) або за допомогою робочої пошти та API-токена.</w:t>
+        <w:t>2. Окремо розробив обов'язкове модальне вікно авторизації таргетолога з можливістю швидкого входу через Google / Meta Business акаунт (OAuth 2.0) або за допомогою робочої пошти та API-токена.</w:t>
       </w:r>
     </w:p>
     <w:p>

</xml_diff>

<commit_message>
docs: update report figures with newly rendered minimalist UI mockups
</commit_message>
<xml_diff>
--- a/docs/Laboratorna_Robota_2_Bahyn_MkV_Sales_Manager.docx
+++ b/docs/Laboratorna_Robota_2_Bahyn_MkV_Sales_Manager.docx
@@ -1636,7 +1636,7 @@
       <w:r>
         <w:drawing>
           <wp:inline xmlns:a="http://schemas.openxmlformats.org/drawingml/2006/main" xmlns:pic="http://schemas.openxmlformats.org/drawingml/2006/picture">
-            <wp:extent cx="5669280" cy="3779520"/>
+            <wp:extent cx="5669280" cy="3543300"/>
             <wp:docPr id="1" name="Picture 1"/>
             <wp:cNvGraphicFramePr>
               <a:graphicFrameLocks noChangeAspect="1"/>
@@ -1645,7 +1645,7 @@
               <a:graphicData uri="http://schemas.openxmlformats.org/drawingml/2006/picture">
                 <pic:pic>
                   <pic:nvPicPr>
-                    <pic:cNvPr id="0" name="img_10_image1.png"/>
+                    <pic:cNvPr id="0" name="fig_1_1.png"/>
                     <pic:cNvPicPr/>
                   </pic:nvPicPr>
                   <pic:blipFill>
@@ -1657,7 +1657,7 @@
                   <pic:spPr>
                     <a:xfrm>
                       <a:off x="0" y="0"/>
-                      <a:ext cx="5669280" cy="3779520"/>
+                      <a:ext cx="5669280" cy="3543300"/>
                     </a:xfrm>
                     <a:prstGeom prst="rect"/>
                   </pic:spPr>
@@ -3082,7 +3082,7 @@
       <w:r>
         <w:drawing>
           <wp:inline xmlns:a="http://schemas.openxmlformats.org/drawingml/2006/main" xmlns:pic="http://schemas.openxmlformats.org/drawingml/2006/picture">
-            <wp:extent cx="5669280" cy="3779520"/>
+            <wp:extent cx="5669280" cy="3543300"/>
             <wp:docPr id="2" name="Picture 2"/>
             <wp:cNvGraphicFramePr>
               <a:graphicFrameLocks noChangeAspect="1"/>
@@ -3091,7 +3091,7 @@
               <a:graphicData uri="http://schemas.openxmlformats.org/drawingml/2006/picture">
                 <pic:pic>
                   <pic:nvPicPr>
-                    <pic:cNvPr id="0" name="img_4_image2.png"/>
+                    <pic:cNvPr id="0" name="fig_2_1.png"/>
                     <pic:cNvPicPr/>
                   </pic:nvPicPr>
                   <pic:blipFill>
@@ -3103,7 +3103,7 @@
                   <pic:spPr>
                     <a:xfrm>
                       <a:off x="0" y="0"/>
-                      <a:ext cx="5669280" cy="3779520"/>
+                      <a:ext cx="5669280" cy="3543300"/>
                     </a:xfrm>
                     <a:prstGeom prst="rect"/>
                   </pic:spPr>
@@ -3167,7 +3167,7 @@
       <w:r>
         <w:drawing>
           <wp:inline xmlns:a="http://schemas.openxmlformats.org/drawingml/2006/main" xmlns:pic="http://schemas.openxmlformats.org/drawingml/2006/picture">
-            <wp:extent cx="5669280" cy="3779520"/>
+            <wp:extent cx="5669280" cy="3543300"/>
             <wp:docPr id="3" name="Picture 3"/>
             <wp:cNvGraphicFramePr>
               <a:graphicFrameLocks noChangeAspect="1"/>
@@ -3176,7 +3176,7 @@
               <a:graphicData uri="http://schemas.openxmlformats.org/drawingml/2006/picture">
                 <pic:pic>
                   <pic:nvPicPr>
-                    <pic:cNvPr id="0" name="img_0_image3.png"/>
+                    <pic:cNvPr id="0" name="fig_2_2.png"/>
                     <pic:cNvPicPr/>
                   </pic:nvPicPr>
                   <pic:blipFill>
@@ -3188,7 +3188,7 @@
                   <pic:spPr>
                     <a:xfrm>
                       <a:off x="0" y="0"/>
-                      <a:ext cx="5669280" cy="3779520"/>
+                      <a:ext cx="5669280" cy="3543300"/>
                     </a:xfrm>
                     <a:prstGeom prst="rect"/>
                   </pic:spPr>
@@ -3252,7 +3252,7 @@
       <w:r>
         <w:drawing>
           <wp:inline xmlns:a="http://schemas.openxmlformats.org/drawingml/2006/main" xmlns:pic="http://schemas.openxmlformats.org/drawingml/2006/picture">
-            <wp:extent cx="5669280" cy="3779520"/>
+            <wp:extent cx="5669280" cy="3543300"/>
             <wp:docPr id="4" name="Picture 4"/>
             <wp:cNvGraphicFramePr>
               <a:graphicFrameLocks noChangeAspect="1"/>
@@ -3261,7 +3261,7 @@
               <a:graphicData uri="http://schemas.openxmlformats.org/drawingml/2006/picture">
                 <pic:pic>
                   <pic:nvPicPr>
-                    <pic:cNvPr id="0" name="img_16_image4.png"/>
+                    <pic:cNvPr id="0" name="fig_2_3.png"/>
                     <pic:cNvPicPr/>
                   </pic:nvPicPr>
                   <pic:blipFill>
@@ -3273,7 +3273,7 @@
                   <pic:spPr>
                     <a:xfrm>
                       <a:off x="0" y="0"/>
-                      <a:ext cx="5669280" cy="3779520"/>
+                      <a:ext cx="5669280" cy="3543300"/>
                     </a:xfrm>
                     <a:prstGeom prst="rect"/>
                   </pic:spPr>
@@ -3337,7 +3337,7 @@
       <w:r>
         <w:drawing>
           <wp:inline xmlns:a="http://schemas.openxmlformats.org/drawingml/2006/main" xmlns:pic="http://schemas.openxmlformats.org/drawingml/2006/picture">
-            <wp:extent cx="5669280" cy="3779520"/>
+            <wp:extent cx="5669280" cy="3543300"/>
             <wp:docPr id="5" name="Picture 5"/>
             <wp:cNvGraphicFramePr>
               <a:graphicFrameLocks noChangeAspect="1"/>
@@ -3346,7 +3346,7 @@
               <a:graphicData uri="http://schemas.openxmlformats.org/drawingml/2006/picture">
                 <pic:pic>
                   <pic:nvPicPr>
-                    <pic:cNvPr id="0" name="img_14_image5.png"/>
+                    <pic:cNvPr id="0" name="fig_2_4.png"/>
                     <pic:cNvPicPr/>
                   </pic:nvPicPr>
                   <pic:blipFill>
@@ -3358,7 +3358,7 @@
                   <pic:spPr>
                     <a:xfrm>
                       <a:off x="0" y="0"/>
-                      <a:ext cx="5669280" cy="3779520"/>
+                      <a:ext cx="5669280" cy="3543300"/>
                     </a:xfrm>
                     <a:prstGeom prst="rect"/>
                   </pic:spPr>
@@ -3422,7 +3422,7 @@
       <w:r>
         <w:drawing>
           <wp:inline xmlns:a="http://schemas.openxmlformats.org/drawingml/2006/main" xmlns:pic="http://schemas.openxmlformats.org/drawingml/2006/picture">
-            <wp:extent cx="5669280" cy="3779520"/>
+            <wp:extent cx="5669280" cy="3543300"/>
             <wp:docPr id="6" name="Picture 6"/>
             <wp:cNvGraphicFramePr>
               <a:graphicFrameLocks noChangeAspect="1"/>
@@ -3431,7 +3431,7 @@
               <a:graphicData uri="http://schemas.openxmlformats.org/drawingml/2006/picture">
                 <pic:pic>
                   <pic:nvPicPr>
-                    <pic:cNvPr id="0" name="img_17_image9.png"/>
+                    <pic:cNvPr id="0" name="fig_2_5.png"/>
                     <pic:cNvPicPr/>
                   </pic:nvPicPr>
                   <pic:blipFill>
@@ -3443,7 +3443,7 @@
                   <pic:spPr>
                     <a:xfrm>
                       <a:off x="0" y="0"/>
-                      <a:ext cx="5669280" cy="3779520"/>
+                      <a:ext cx="5669280" cy="3543300"/>
                     </a:xfrm>
                     <a:prstGeom prst="rect"/>
                   </pic:spPr>

</xml_diff>

<commit_message>
fix(docs): update teacher patronymic to Бучук Роман Юрійович across all docs
</commit_message>
<xml_diff>
--- a/docs/Laboratorna_Robota_2_Bahyn_MkV_Sales_Manager.docx
+++ b/docs/Laboratorna_Robota_2_Bahyn_MkV_Sales_Manager.docx
@@ -111,6 +111,24 @@
           <w:sz w:val="28"/>
         </w:rPr>
         <w:t>Багин Михайло Михайлович</w:t>
+        <w:br/>
+        <w:br/>
+      </w:r>
+      <w:r>
+        <w:rPr>
+          <w:rFonts w:ascii="Times New Roman" w:hAnsi="Times New Roman"/>
+          <w:sz w:val="28"/>
+        </w:rPr>
+        <w:t>Перевірив:</w:t>
+        <w:br/>
+      </w:r>
+      <w:r>
+        <w:rPr>
+          <w:rFonts w:ascii="Times New Roman" w:hAnsi="Times New Roman"/>
+          <w:b/>
+          <w:sz w:val="28"/>
+        </w:rPr>
+        <w:t>Бучук Роман Юрійович</w:t>
       </w:r>
     </w:p>
     <w:p>
@@ -3663,7 +3681,7 @@
           <w:i w:val="0"/>
           <w:sz w:val="28"/>
         </w:rPr>
-        <w:t>У налаштуваннях репозиторію (Manage access) додано викладача romanbuchuk як рецензента з правами перегляду та перевірки напрацювань (рис. 3.2).</w:t>
+        <w:t>У налаштуваннях репозиторію (Manage access) додано викладача Бучука Романа Юрійовича (romanbuchuk) як рецензента з правами перегляду та перевірки напрацювань (рис. 3.2).</w:t>
       </w:r>
     </w:p>
     <w:p>
@@ -3854,7 +3872,7 @@
           <w:i w:val="0"/>
           <w:sz w:val="28"/>
         </w:rPr>
-        <w:t>З робочої гілки feature/ui-ux-design відкрито Pull Request у гілку main із описом виконаної роботи. У розділі Reviewers призначено викладача romanbuchuk для перевірки, як показано на рисунку 3.2.</w:t>
+        <w:t>З робочої гілки feature/ui-ux-design відкрито Pull Request у гілку main із описом виконаної роботи. У розділі Reviewers призначено викладача Бучука Романа Юрійовича (romanbuchuk) для перевірки, як показано на рисунку 3.2.</w:t>
       </w:r>
     </w:p>
     <w:p>
@@ -3909,7 +3927,7 @@
           <w:rFonts w:ascii="Times New Roman" w:hAnsi="Times New Roman"/>
           <w:sz w:val="24"/>
         </w:rPr>
-        <w:t>Рис. 3.2. Додавання викладача romanbuchuk як рецензента (Collaborator) на GitHub</w:t>
+        <w:t>Рис. 3.2. Додавання викладача Бучука Романа Юрійовича (romanbuchuk) як рецензента (Collaborator) на GitHub</w:t>
       </w:r>
     </w:p>
     <w:p>
@@ -4035,7 +4053,7 @@
           <w:i w:val="0"/>
           <w:sz w:val="28"/>
         </w:rPr>
-        <w:t>6. Налаштував систему контролю версій Git та репозиторій на GitHub під студентським акаунтом: завантажив файли через безпечний SSH-ключ, оформив зрозумілий README.md з описом роботи, створив окрему гілку feature/ui-ux-design та запросив викладача (romanbuchuk) для перевірки.</w:t>
+        <w:t>6. Налаштував систему контролю версій Git та репозиторій на GitHub під студентським акаунтом: завантажив файли через безпечний SSH-ключ, оформив зрозумілий README.md з описом роботи, створив окрему гілку feature/ui-ux-design та запросив викладача Бучука Романа Юрійовича (romanbuchuk) для перевірки.</w:t>
       </w:r>
     </w:p>
     <w:sectPr>

</xml_diff>